<commit_message>
Fix Datos Personales - Word
</commit_message>
<xml_diff>
--- a/webapp/templates/word/Datos_Personales.docx
+++ b/webapp/templates/word/Datos_Personales.docx
@@ -387,7 +387,7 @@
                 </mc:Choice>
                 <mc:Fallback>
                   <w:pict>
-                    <v:group w14:anchorId="672FEA22" id="Group 3" o:spid="_x0000_s1026" style="position:absolute;margin-left:3.5pt;margin-top:28.25pt;width:221.6pt;height:.45pt;z-index:-251658752;mso-wrap-distance-left:0;mso-wrap-distance-right:0" coordsize="28143,57" o:gfxdata="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">
+                    <v:group w14:anchorId="186FDBBF" id="Group 3" o:spid="_x0000_s1026" style="position:absolute;margin-left:3.5pt;margin-top:28.25pt;width:221.6pt;height:.45pt;z-index:-251658752;mso-wrap-distance-left:0;mso-wrap-distance-right:0" coordsize="28143,57" o:gfxdata="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">
                       <v:shape id="Graphic 4" o:spid="_x0000_s1027" style="position:absolute;top:28;width:28143;height:13;visibility:visible;mso-wrap-style:square;v-text-anchor:top" coordsize="2814320,1270" o:gfxdata="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" path="m,l2814059,e" filled="f" strokeweight=".45pt">
                         <v:path arrowok="t"/>
                       </v:shape>
@@ -875,7 +875,7 @@
                 </mc:Choice>
                 <mc:Fallback>
                   <w:pict>
-                    <v:group w14:anchorId="0AF7385B" id="Group 5" o:spid="_x0000_s1026" style="position:absolute;margin-left:2.85pt;margin-top:18.2pt;width:484.15pt;height:.45pt;z-index:-251651584;mso-wrap-distance-left:0;mso-wrap-distance-right:0" coordsize="61487,57" o:gfxdata="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">
+                    <v:group w14:anchorId="5B0BF194" id="Group 5" o:spid="_x0000_s1026" style="position:absolute;margin-left:2.85pt;margin-top:18.2pt;width:484.15pt;height:.45pt;z-index:-251651584;mso-wrap-distance-left:0;mso-wrap-distance-right:0" coordsize="61487,57" o:gfxdata="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">
                       <v:shape id="Graphic 6" o:spid="_x0000_s1027" style="position:absolute;top:28;width:61487;height:13;visibility:visible;mso-wrap-style:square;v-text-anchor:top" coordsize="6148705,1270" o:gfxdata="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" path="m,l6148546,e" filled="f" strokeweight=".45pt">
                         <v:path arrowok="t"/>
                       </v:shape>
@@ -1019,7 +1019,7 @@
       </w:tr>
       <w:tr>
         <w:trPr>
-          <w:trHeight w:val="276"/>
+          <w:trHeight w:val="327"/>
         </w:trPr>
         <w:tc>
           <w:tcPr>
@@ -1386,7 +1386,7 @@
       </w:tr>
       <w:tr>
         <w:trPr>
-          <w:trHeight w:val="266"/>
+          <w:trHeight w:val="331"/>
         </w:trPr>
         <w:tc>
           <w:tcPr>
@@ -1515,7 +1515,7 @@
       </w:tr>
       <w:tr>
         <w:trPr>
-          <w:trHeight w:val="205"/>
+          <w:trHeight w:val="351"/>
         </w:trPr>
         <w:tc>
           <w:tcPr>
@@ -1605,7 +1605,7 @@
       </w:tr>
       <w:tr>
         <w:trPr>
-          <w:trHeight w:val="820"/>
+          <w:trHeight w:val="555"/>
         </w:trPr>
         <w:tc>
           <w:tcPr>
@@ -2634,7 +2634,7 @@
       </w:tr>
       <w:tr>
         <w:trPr>
-          <w:trHeight w:val="1140"/>
+          <w:trHeight w:val="711"/>
         </w:trPr>
         <w:tc>
           <w:tcPr>
@@ -3309,7 +3309,7 @@
       </w:tr>
       <w:tr>
         <w:trPr>
-          <w:trHeight w:val="278"/>
+          <w:trHeight w:val="273"/>
         </w:trPr>
         <w:tc>
           <w:tcPr>
@@ -3527,7 +3527,7 @@
       </w:tr>
       <w:tr>
         <w:trPr>
-          <w:trHeight w:val="1122"/>
+          <w:trHeight w:val="976"/>
         </w:trPr>
         <w:tc>
           <w:tcPr>
@@ -4189,7 +4189,7 @@
       </w:tr>
       <w:tr>
         <w:trPr>
-          <w:trHeight w:val="288"/>
+          <w:trHeight w:val="284"/>
         </w:trPr>
         <w:tc>
           <w:tcPr>
@@ -4331,7 +4331,7 @@
       </w:tr>
       <w:tr>
         <w:trPr>
-          <w:trHeight w:val="263"/>
+          <w:trHeight w:val="274"/>
         </w:trPr>
         <w:tc>
           <w:tcPr>
@@ -5076,7 +5076,7 @@
       </w:tr>
       <w:tr>
         <w:trPr>
-          <w:trHeight w:val="284"/>
+          <w:trHeight w:val="295"/>
         </w:trPr>
         <w:tc>
           <w:tcPr>
@@ -5220,7 +5220,7 @@
       </w:tr>
       <w:tr>
         <w:trPr>
-          <w:trHeight w:val="273"/>
+          <w:trHeight w:val="272"/>
         </w:trPr>
         <w:tc>
           <w:tcPr>
@@ -5294,7 +5294,7 @@
       </w:tr>
       <w:tr>
         <w:trPr>
-          <w:trHeight w:val="261"/>
+          <w:trHeight w:val="134"/>
         </w:trPr>
         <w:tc>
           <w:tcPr>
@@ -6050,7 +6050,7 @@
       </w:tr>
       <w:tr>
         <w:trPr>
-          <w:trHeight w:val="412"/>
+          <w:trHeight w:val="278"/>
         </w:trPr>
         <w:tc>
           <w:tcPr>
@@ -7120,7 +7120,7 @@
       </w:tr>
       <w:tr>
         <w:trPr>
-          <w:trHeight w:val="205"/>
+          <w:trHeight w:val="265"/>
         </w:trPr>
         <w:tc>
           <w:tcPr>
@@ -7904,7 +7904,7 @@
       </w:tr>
       <w:tr>
         <w:trPr>
-          <w:trHeight w:val="332"/>
+          <w:trHeight w:val="146"/>
         </w:trPr>
         <w:tc>
           <w:tcPr>
@@ -8437,7 +8437,7 @@
       </w:tr>
       <w:tr>
         <w:trPr>
-          <w:trHeight w:val="233"/>
+          <w:trHeight w:val="282"/>
         </w:trPr>
         <w:tc>
           <w:tcPr>
@@ -8597,7 +8597,7 @@
       </w:tr>
       <w:tr>
         <w:trPr>
-          <w:trHeight w:val="207"/>
+          <w:trHeight w:val="257"/>
         </w:trPr>
         <w:tc>
           <w:tcPr>
@@ -8742,7 +8742,7 @@
       </w:tr>
       <w:tr>
         <w:trPr>
-          <w:trHeight w:val="2478"/>
+          <w:trHeight w:val="2174"/>
         </w:trPr>
         <w:tc>
           <w:tcPr>
@@ -8949,7 +8949,7 @@
                 </mc:Choice>
                 <mc:Fallback>
                   <w:pict>
-                    <v:group w14:anchorId="0FC322E3" id="Group 7" o:spid="_x0000_s1026" style="width:79.5pt;height:80.5pt;mso-position-horizontal-relative:char;mso-position-vertical-relative:line" coordsize="10096,10223" o:gfxdata="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">
+                    <v:group w14:anchorId="7A8B7A48" id="Group 7" o:spid="_x0000_s1026" style="width:79.5pt;height:80.5pt;mso-position-horizontal-relative:char;mso-position-vertical-relative:line" coordsize="10096,10223" o:gfxdata="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">
                       <v:shape id="Graphic 8" o:spid="_x0000_s1027" style="position:absolute;left:63;top:63;width:9970;height:10097;visibility:visible;mso-wrap-style:square;v-text-anchor:top" coordsize="996950,1009650" o:gfxdata="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" path="m,1009650r996950,l996950,,,,,1009650xe" filled="f" strokecolor="#f4791f" strokeweight="1pt">
                         <v:path arrowok="t"/>
                       </v:shape>

</xml_diff>